<commit_message>
ANFIS experiments notebooks and results added.
</commit_message>
<xml_diff>
--- a/misc/results/Iatest experiment documentation.docx
+++ b/misc/results/Iatest experiment documentation.docx
@@ -192,7 +192,7 @@
                     <pic:cNvPicPr/>
                   </pic:nvPicPr>
                   <pic:blipFill>
-                    <a:blip r:embed="rId7"/>
+                    <a:blip r:embed="rId8"/>
                     <a:stretch>
                       <a:fillRect/>
                     </a:stretch>
@@ -13442,6 +13442,2399 @@
       </w:r>
       <w:proofErr w:type="spellEnd"/>
     </w:p>
+    <w:p>
+      <w:pPr>
+        <w:rPr>
+          <w:b/>
+          <w:bCs/>
+        </w:rPr>
+      </w:pPr>
+      <w:r>
+        <w:rPr>
+          <w:b/>
+          <w:bCs/>
+        </w:rPr>
+        <w:lastRenderedPageBreak/>
+        <w:t>previous best model</w:t>
+      </w:r>
+      <w:r>
+        <w:rPr>
+          <w:b/>
+          <w:bCs/>
+        </w:rPr>
+        <w:t xml:space="preserve"> features</w:t>
+      </w:r>
+      <w:r>
+        <w:rPr>
+          <w:b/>
+          <w:bCs/>
+        </w:rPr>
+        <w:t>:</w:t>
+      </w:r>
+      <w:r>
+        <w:rPr>
+          <w:b/>
+          <w:bCs/>
+        </w:rPr>
+        <w:br/>
+        <w:t xml:space="preserve"> </w:t>
+      </w:r>
+    </w:p>
+    <w:p>
+      <w:r>
+        <w:t xml:space="preserve">age </w:t>
+      </w:r>
+    </w:p>
+    <w:p>
+      <w:proofErr w:type="spellStart"/>
+      <w:r>
+        <w:t>blood_urea_nitrogen</w:t>
+      </w:r>
+      <w:proofErr w:type="spellEnd"/>
+      <w:r>
+        <w:t xml:space="preserve"> </w:t>
+      </w:r>
+    </w:p>
+    <w:p>
+      <w:r>
+        <w:t xml:space="preserve">hba1c </w:t>
+      </w:r>
+    </w:p>
+    <w:p>
+      <w:proofErr w:type="spellStart"/>
+      <w:r>
+        <w:t>taking_bp_medicine</w:t>
+      </w:r>
+      <w:proofErr w:type="spellEnd"/>
+      <w:r>
+        <w:t xml:space="preserve"> </w:t>
+      </w:r>
+    </w:p>
+    <w:p>
+      <w:proofErr w:type="spellStart"/>
+      <w:r>
+        <w:t>mean_sbp</w:t>
+      </w:r>
+      <w:proofErr w:type="spellEnd"/>
+      <w:r>
+        <w:t xml:space="preserve"> </w:t>
+      </w:r>
+    </w:p>
+    <w:p>
+      <w:r>
+        <w:t xml:space="preserve">glucose </w:t>
+      </w:r>
+    </w:p>
+    <w:p>
+      <w:proofErr w:type="spellStart"/>
+      <w:r>
+        <w:t>hypertension_doctor_told</w:t>
+      </w:r>
+      <w:proofErr w:type="spellEnd"/>
+      <w:r>
+        <w:t xml:space="preserve"> </w:t>
+      </w:r>
+    </w:p>
+    <w:p>
+      <w:proofErr w:type="spellStart"/>
+      <w:r>
+        <w:t>uric_acid</w:t>
+      </w:r>
+      <w:proofErr w:type="spellEnd"/>
+      <w:r>
+        <w:t xml:space="preserve"> </w:t>
+      </w:r>
+    </w:p>
+    <w:p>
+      <w:proofErr w:type="spellStart"/>
+      <w:r>
+        <w:t>diabetes_yes</w:t>
+      </w:r>
+      <w:proofErr w:type="spellEnd"/>
+      <w:r>
+        <w:t xml:space="preserve"> </w:t>
+      </w:r>
+    </w:p>
+    <w:p>
+      <w:proofErr w:type="spellStart"/>
+      <w:r>
+        <w:t>income_poverty_ratio</w:t>
+      </w:r>
+      <w:proofErr w:type="spellEnd"/>
+      <w:r>
+        <w:t xml:space="preserve"> </w:t>
+      </w:r>
+    </w:p>
+    <w:p>
+      <w:proofErr w:type="spellStart"/>
+      <w:r>
+        <w:t>mean_dbp</w:t>
+      </w:r>
+      <w:proofErr w:type="spellEnd"/>
+      <w:r>
+        <w:t xml:space="preserve"> </w:t>
+      </w:r>
+    </w:p>
+    <w:p>
+      <w:r>
+        <w:t xml:space="preserve">hemoglobin </w:t>
+      </w:r>
+    </w:p>
+    <w:p>
+      <w:r>
+        <w:t xml:space="preserve">waist </w:t>
+      </w:r>
+    </w:p>
+    <w:p>
+      <w:proofErr w:type="spellStart"/>
+      <w:r>
+        <w:t>serum_albumin</w:t>
+      </w:r>
+      <w:proofErr w:type="spellEnd"/>
+      <w:r>
+        <w:t xml:space="preserve"> </w:t>
+      </w:r>
+    </w:p>
+    <w:p>
+      <w:pPr>
+        <w:rPr>
+          <w:b/>
+          <w:bCs/>
+        </w:rPr>
+      </w:pPr>
+      <w:proofErr w:type="spellStart"/>
+      <w:r>
+        <w:rPr>
+          <w:b/>
+          <w:bCs/>
+        </w:rPr>
+        <w:t>mean_pulse</w:t>
+      </w:r>
+      <w:proofErr w:type="spellEnd"/>
+      <w:r>
+        <w:rPr>
+          <w:b/>
+          <w:bCs/>
+        </w:rPr>
+        <w:t xml:space="preserve"> </w:t>
+      </w:r>
+    </w:p>
+    <w:p>
+      <w:pPr>
+        <w:rPr>
+          <w:b/>
+          <w:bCs/>
+        </w:rPr>
+      </w:pPr>
+      <w:proofErr w:type="spellStart"/>
+      <w:r>
+        <w:rPr>
+          <w:b/>
+          <w:bCs/>
+        </w:rPr>
+        <w:t>bmi</w:t>
+      </w:r>
+      <w:proofErr w:type="spellEnd"/>
+      <w:r>
+        <w:rPr>
+          <w:b/>
+          <w:bCs/>
+        </w:rPr>
+        <w:t xml:space="preserve"> </w:t>
+      </w:r>
+    </w:p>
+    <w:p>
+      <w:pPr>
+        <w:rPr>
+          <w:b/>
+          <w:bCs/>
+        </w:rPr>
+      </w:pPr>
+      <w:proofErr w:type="spellStart"/>
+      <w:r>
+        <w:rPr>
+          <w:b/>
+          <w:bCs/>
+        </w:rPr>
+        <w:t>taking_cholesterol_medicine</w:t>
+      </w:r>
+      <w:proofErr w:type="spellEnd"/>
+      <w:r>
+        <w:rPr>
+          <w:b/>
+          <w:bCs/>
+        </w:rPr>
+        <w:t xml:space="preserve"> </w:t>
+      </w:r>
+    </w:p>
+    <w:p>
+      <w:pPr>
+        <w:rPr>
+          <w:b/>
+          <w:bCs/>
+        </w:rPr>
+      </w:pPr>
+      <w:r>
+        <w:rPr>
+          <w:b/>
+          <w:bCs/>
+        </w:rPr>
+        <w:t xml:space="preserve">potassium </w:t>
+      </w:r>
+    </w:p>
+    <w:p>
+      <w:pPr>
+        <w:rPr>
+          <w:b/>
+          <w:bCs/>
+        </w:rPr>
+      </w:pPr>
+      <w:r>
+        <w:rPr>
+          <w:b/>
+          <w:bCs/>
+        </w:rPr>
+        <w:t>sodium</w:t>
+      </w:r>
+    </w:p>
+    <w:p>
+      <w:pPr>
+        <w:rPr>
+          <w:b/>
+          <w:bCs/>
+        </w:rPr>
+      </w:pPr>
+    </w:p>
+    <w:p>
+      <w:pPr>
+        <w:rPr>
+          <w:b/>
+          <w:bCs/>
+        </w:rPr>
+      </w:pPr>
+    </w:p>
+    <w:p>
+      <w:pPr>
+        <w:rPr>
+          <w:b/>
+          <w:bCs/>
+        </w:rPr>
+      </w:pPr>
+    </w:p>
+    <w:p>
+      <w:pPr>
+        <w:rPr>
+          <w:b/>
+          <w:bCs/>
+        </w:rPr>
+      </w:pPr>
+    </w:p>
+    <w:p>
+      <w:pPr>
+        <w:rPr>
+          <w:b/>
+          <w:bCs/>
+        </w:rPr>
+      </w:pPr>
+    </w:p>
+    <w:p>
+      <w:pPr>
+        <w:rPr>
+          <w:b/>
+          <w:bCs/>
+        </w:rPr>
+      </w:pPr>
+    </w:p>
+    <w:p>
+      <w:pPr>
+        <w:rPr>
+          <w:b/>
+          <w:bCs/>
+        </w:rPr>
+      </w:pPr>
+    </w:p>
+    <w:p>
+      <w:pPr>
+        <w:rPr>
+          <w:b/>
+          <w:bCs/>
+        </w:rPr>
+      </w:pPr>
+    </w:p>
+    <w:p>
+      <w:pPr>
+        <w:rPr>
+          <w:b/>
+          <w:bCs/>
+        </w:rPr>
+      </w:pPr>
+      <w:r>
+        <w:rPr>
+          <w:b/>
+          <w:bCs/>
+        </w:rPr>
+        <w:lastRenderedPageBreak/>
+        <w:t>Experiments:</w:t>
+      </w:r>
+    </w:p>
+    <w:tbl>
+      <w:tblPr>
+        <w:tblStyle w:val="TableGrid"/>
+        <w:tblW w:w="0" w:type="auto"/>
+        <w:tblLook w:val="04A0" w:firstRow="1" w:lastRow="0" w:firstColumn="1" w:lastColumn="0" w:noHBand="0" w:noVBand="1"/>
+      </w:tblPr>
+      <w:tblGrid>
+        <w:gridCol w:w="1367"/>
+        <w:gridCol w:w="4315"/>
+        <w:gridCol w:w="3668"/>
+      </w:tblGrid>
+      <w:tr>
+        <w:tc>
+          <w:tcPr>
+            <w:tcW w:w="0" w:type="auto"/>
+            <w:hideMark/>
+          </w:tcPr>
+          <w:p>
+            <w:pPr>
+              <w:spacing w:after="160" w:line="259" w:lineRule="auto"/>
+              <w:rPr>
+                <w:b/>
+                <w:bCs/>
+              </w:rPr>
+            </w:pPr>
+            <w:r>
+              <w:rPr>
+                <w:b/>
+                <w:bCs/>
+              </w:rPr>
+              <w:t>Experiment</w:t>
+            </w:r>
+          </w:p>
+        </w:tc>
+        <w:tc>
+          <w:tcPr>
+            <w:tcW w:w="0" w:type="auto"/>
+            <w:hideMark/>
+          </w:tcPr>
+          <w:p>
+            <w:pPr>
+              <w:spacing w:after="160" w:line="259" w:lineRule="auto"/>
+              <w:rPr>
+                <w:b/>
+                <w:bCs/>
+              </w:rPr>
+            </w:pPr>
+            <w:r>
+              <w:rPr>
+                <w:b/>
+                <w:bCs/>
+              </w:rPr>
+              <w:t>Stage 1</w:t>
+            </w:r>
+          </w:p>
+        </w:tc>
+        <w:tc>
+          <w:tcPr>
+            <w:tcW w:w="0" w:type="auto"/>
+            <w:hideMark/>
+          </w:tcPr>
+          <w:p>
+            <w:pPr>
+              <w:spacing w:after="160" w:line="259" w:lineRule="auto"/>
+              <w:rPr>
+                <w:b/>
+                <w:bCs/>
+              </w:rPr>
+            </w:pPr>
+            <w:r>
+              <w:rPr>
+                <w:b/>
+                <w:bCs/>
+              </w:rPr>
+              <w:t>Stage 2</w:t>
+            </w:r>
+          </w:p>
+        </w:tc>
+      </w:tr>
+      <w:tr>
+        <w:tc>
+          <w:tcPr>
+            <w:tcW w:w="0" w:type="auto"/>
+            <w:hideMark/>
+          </w:tcPr>
+          <w:p>
+            <w:pPr>
+              <w:spacing w:after="160" w:line="259" w:lineRule="auto"/>
+            </w:pPr>
+            <w:r>
+              <w:rPr>
+                <w:b/>
+                <w:bCs/>
+              </w:rPr>
+              <w:t>Baseline</w:t>
+            </w:r>
+          </w:p>
+        </w:tc>
+        <w:tc>
+          <w:tcPr>
+            <w:tcW w:w="0" w:type="auto"/>
+            <w:hideMark/>
+          </w:tcPr>
+          <w:p>
+            <w:pPr>
+              <w:spacing w:after="160" w:line="259" w:lineRule="auto"/>
+            </w:pPr>
+            <w:r>
+              <w:t>13-feature RF + ROS</w:t>
+            </w:r>
+          </w:p>
+        </w:tc>
+        <w:tc>
+          <w:tcPr>
+            <w:tcW w:w="0" w:type="auto"/>
+            <w:hideMark/>
+          </w:tcPr>
+          <w:p>
+            <w:pPr>
+              <w:spacing w:after="160" w:line="259" w:lineRule="auto"/>
+            </w:pPr>
+            <w:r>
+              <w:t>direct-six GBM + OBU</w:t>
+            </w:r>
+          </w:p>
+        </w:tc>
+      </w:tr>
+      <w:tr>
+        <w:tc>
+          <w:tcPr>
+            <w:tcW w:w="0" w:type="auto"/>
+            <w:hideMark/>
+          </w:tcPr>
+          <w:p>
+            <w:pPr>
+              <w:spacing w:after="160" w:line="259" w:lineRule="auto"/>
+            </w:pPr>
+            <w:r>
+              <w:rPr>
+                <w:b/>
+                <w:bCs/>
+              </w:rPr>
+              <w:t>ANFIS-A</w:t>
+            </w:r>
+          </w:p>
+        </w:tc>
+        <w:tc>
+          <w:tcPr>
+            <w:tcW w:w="0" w:type="auto"/>
+            <w:hideMark/>
+          </w:tcPr>
+          <w:p>
+            <w:pPr>
+              <w:spacing w:after="160" w:line="259" w:lineRule="auto"/>
+            </w:pPr>
+            <w:r>
+              <w:t xml:space="preserve"> RF</w:t>
+            </w:r>
+          </w:p>
+        </w:tc>
+        <w:tc>
+          <w:tcPr>
+            <w:tcW w:w="0" w:type="auto"/>
+            <w:hideMark/>
+          </w:tcPr>
+          <w:p>
+            <w:pPr>
+              <w:spacing w:after="160" w:line="259" w:lineRule="auto"/>
+            </w:pPr>
+            <w:r>
+              <w:t xml:space="preserve">Six-feature ANFIS, </w:t>
+            </w:r>
+            <w:r>
+              <w:t xml:space="preserve">without </w:t>
+            </w:r>
+            <w:r>
+              <w:t xml:space="preserve">resampling </w:t>
+            </w:r>
+          </w:p>
+        </w:tc>
+      </w:tr>
+      <w:tr>
+        <w:tc>
+          <w:tcPr>
+            <w:tcW w:w="0" w:type="auto"/>
+            <w:hideMark/>
+          </w:tcPr>
+          <w:p>
+            <w:pPr>
+              <w:spacing w:after="160" w:line="259" w:lineRule="auto"/>
+            </w:pPr>
+            <w:r>
+              <w:rPr>
+                <w:b/>
+                <w:bCs/>
+              </w:rPr>
+              <w:t>ANFIS-B</w:t>
+            </w:r>
+          </w:p>
+        </w:tc>
+        <w:tc>
+          <w:tcPr>
+            <w:tcW w:w="0" w:type="auto"/>
+            <w:hideMark/>
+          </w:tcPr>
+          <w:p>
+            <w:pPr>
+              <w:spacing w:after="160" w:line="259" w:lineRule="auto"/>
+            </w:pPr>
+            <w:r>
+              <w:t>RF</w:t>
+            </w:r>
+          </w:p>
+        </w:tc>
+        <w:tc>
+          <w:tcPr>
+            <w:tcW w:w="0" w:type="auto"/>
+            <w:hideMark/>
+          </w:tcPr>
+          <w:p>
+            <w:pPr>
+              <w:spacing w:after="160" w:line="259" w:lineRule="auto"/>
+            </w:pPr>
+            <w:r>
+              <w:t>Six-feature ANFIS + current OBU</w:t>
+            </w:r>
+          </w:p>
+        </w:tc>
+      </w:tr>
+      <w:tr>
+        <w:tc>
+          <w:tcPr>
+            <w:tcW w:w="0" w:type="auto"/>
+            <w:hideMark/>
+          </w:tcPr>
+          <w:p>
+            <w:pPr>
+              <w:spacing w:after="160" w:line="259" w:lineRule="auto"/>
+            </w:pPr>
+            <w:r>
+              <w:rPr>
+                <w:b/>
+                <w:bCs/>
+              </w:rPr>
+              <w:t>ANFIS-C</w:t>
+            </w:r>
+          </w:p>
+        </w:tc>
+        <w:tc>
+          <w:tcPr>
+            <w:tcW w:w="0" w:type="auto"/>
+            <w:hideMark/>
+          </w:tcPr>
+          <w:p>
+            <w:pPr>
+              <w:spacing w:after="160" w:line="259" w:lineRule="auto"/>
+            </w:pPr>
+            <w:r>
+              <w:t>Compact seven-feature ANFIS + ROS</w:t>
+            </w:r>
+          </w:p>
+        </w:tc>
+        <w:tc>
+          <w:tcPr>
+            <w:tcW w:w="0" w:type="auto"/>
+            <w:hideMark/>
+          </w:tcPr>
+          <w:p>
+            <w:pPr>
+              <w:spacing w:after="160" w:line="259" w:lineRule="auto"/>
+            </w:pPr>
+            <w:r>
+              <w:t>Selected ANFIS-B Stage 2</w:t>
+            </w:r>
+          </w:p>
+        </w:tc>
+      </w:tr>
+      <w:tr>
+        <w:tc>
+          <w:tcPr>
+            <w:tcW w:w="0" w:type="auto"/>
+            <w:hideMark/>
+          </w:tcPr>
+          <w:p>
+            <w:pPr>
+              <w:spacing w:after="160" w:line="259" w:lineRule="auto"/>
+            </w:pPr>
+            <w:r>
+              <w:rPr>
+                <w:b/>
+                <w:bCs/>
+              </w:rPr>
+              <w:t>ANFIS-D</w:t>
+            </w:r>
+          </w:p>
+        </w:tc>
+        <w:tc>
+          <w:tcPr>
+            <w:tcW w:w="0" w:type="auto"/>
+            <w:hideMark/>
+          </w:tcPr>
+          <w:p>
+            <w:pPr>
+              <w:spacing w:after="160" w:line="259" w:lineRule="auto"/>
+            </w:pPr>
+            <w:proofErr w:type="spellStart"/>
+            <w:r>
+              <w:rPr>
+                <w:rFonts w:ascii="Nirmala UI" w:hAnsi="Nirmala UI" w:cs="Nirmala UI"/>
+              </w:rPr>
+              <w:t>তিনটি</w:t>
+            </w:r>
+            <w:proofErr w:type="spellEnd"/>
+            <w:r>
+              <w:t xml:space="preserve"> one-vs-rest ANFIS, </w:t>
+            </w:r>
+            <w:proofErr w:type="spellStart"/>
+            <w:r>
+              <w:rPr>
+                <w:rFonts w:ascii="Nirmala UI" w:hAnsi="Nirmala UI" w:cs="Nirmala UI"/>
+              </w:rPr>
+              <w:t>সব</w:t>
+            </w:r>
+            <w:proofErr w:type="spellEnd"/>
+            <w:r>
+              <w:t xml:space="preserve"> 14 inputs + ROS</w:t>
+            </w:r>
+          </w:p>
+        </w:tc>
+        <w:tc>
+          <w:tcPr>
+            <w:tcW w:w="0" w:type="auto"/>
+            <w:hideMark/>
+          </w:tcPr>
+          <w:p>
+            <w:pPr>
+              <w:spacing w:after="160" w:line="259" w:lineRule="auto"/>
+            </w:pPr>
+            <w:r>
+              <w:t>Single-stage multiclass</w:t>
+            </w:r>
+          </w:p>
+        </w:tc>
+      </w:tr>
+    </w:tbl>
+    <w:p/>
+    <w:p>
+      <w:pPr>
+        <w:rPr>
+          <w:b/>
+          <w:bCs/>
+        </w:rPr>
+      </w:pPr>
+      <w:r>
+        <w:rPr>
+          <w:b/>
+          <w:bCs/>
+        </w:rPr>
+        <w:t>Threshold:</w:t>
+      </w:r>
+    </w:p>
+    <w:p>
+      <w:r>
+        <w:t>Baseline:</w:t>
+      </w:r>
+    </w:p>
+    <w:p>
+      <w:r>
+        <w:t>Stage 1 = 0.44</w:t>
+      </w:r>
+    </w:p>
+    <w:p>
+      <w:r>
+        <w:t>Stage 2 = 0.50</w:t>
+      </w:r>
+    </w:p>
+    <w:p/>
+    <w:p>
+      <w:r>
+        <w:t>ANFIS-A:</w:t>
+      </w:r>
+    </w:p>
+    <w:p>
+      <w:r>
+        <w:t>Stage 1 = 0.44</w:t>
+      </w:r>
+    </w:p>
+    <w:p>
+      <w:r>
+        <w:t>Stage 2 = 0.24</w:t>
+      </w:r>
+    </w:p>
+    <w:p/>
+    <w:p>
+      <w:r>
+        <w:t>ANFIS-B:</w:t>
+      </w:r>
+    </w:p>
+    <w:p>
+      <w:r>
+        <w:t>Stage 1 = 0.44</w:t>
+      </w:r>
+    </w:p>
+    <w:p>
+      <w:r>
+        <w:t>Stage 2 = 0.32</w:t>
+      </w:r>
+    </w:p>
+    <w:p/>
+    <w:p>
+      <w:r>
+        <w:t>ANFIS-C:</w:t>
+      </w:r>
+    </w:p>
+    <w:p>
+      <w:r>
+        <w:t>Stage 1 = 0.48</w:t>
+      </w:r>
+    </w:p>
+    <w:p>
+      <w:r>
+        <w:t>Stage 2 = 0.30</w:t>
+      </w:r>
+    </w:p>
+    <w:p/>
+    <w:p>
+      <w:r>
+        <w:t>ANFIS-D:</w:t>
+      </w:r>
+    </w:p>
+    <w:p>
+      <w:r>
+        <w:t xml:space="preserve">Highest one-vs-rest score </w:t>
+      </w:r>
+      <w:r>
+        <w:rPr>
+          <w:rFonts w:ascii="Nirmala UI" w:hAnsi="Nirmala UI" w:cs="Nirmala UI"/>
+        </w:rPr>
+        <w:t>or</w:t>
+      </w:r>
+      <w:r>
+        <w:t xml:space="preserve"> Argmax</w:t>
+      </w:r>
+    </w:p>
+    <w:p>
+      <w:pPr>
+        <w:rPr>
+          <w:b/>
+          <w:bCs/>
+        </w:rPr>
+      </w:pPr>
+      <w:r>
+        <w:rPr>
+          <w:b/>
+          <w:bCs/>
+        </w:rPr>
+        <w:lastRenderedPageBreak/>
+        <w:t>Results:</w:t>
+      </w:r>
+    </w:p>
+    <w:tbl>
+      <w:tblPr>
+        <w:tblStyle w:val="TableGrid"/>
+        <w:tblW w:w="0" w:type="auto"/>
+        <w:tblLook w:val="04A0" w:firstRow="1" w:lastRow="0" w:firstColumn="1" w:lastColumn="0" w:noHBand="0" w:noVBand="1"/>
+      </w:tblPr>
+      <w:tblGrid>
+        <w:gridCol w:w="1081"/>
+        <w:gridCol w:w="1145"/>
+        <w:gridCol w:w="870"/>
+        <w:gridCol w:w="1159"/>
+        <w:gridCol w:w="867"/>
+        <w:gridCol w:w="1353"/>
+        <w:gridCol w:w="870"/>
+        <w:gridCol w:w="621"/>
+      </w:tblGrid>
+      <w:tr>
+        <w:tc>
+          <w:tcPr>
+            <w:tcW w:w="0" w:type="auto"/>
+            <w:hideMark/>
+          </w:tcPr>
+          <w:p>
+            <w:pPr>
+              <w:spacing w:after="160" w:line="259" w:lineRule="auto"/>
+              <w:rPr>
+                <w:b/>
+                <w:bCs/>
+              </w:rPr>
+            </w:pPr>
+            <w:r>
+              <w:rPr>
+                <w:b/>
+                <w:bCs/>
+              </w:rPr>
+              <w:t>Model</w:t>
+            </w:r>
+          </w:p>
+        </w:tc>
+        <w:tc>
+          <w:tcPr>
+            <w:tcW w:w="0" w:type="auto"/>
+            <w:hideMark/>
+          </w:tcPr>
+          <w:p>
+            <w:pPr>
+              <w:spacing w:after="160" w:line="259" w:lineRule="auto"/>
+              <w:rPr>
+                <w:b/>
+                <w:bCs/>
+              </w:rPr>
+            </w:pPr>
+            <w:r>
+              <w:rPr>
+                <w:b/>
+                <w:bCs/>
+              </w:rPr>
+              <w:t>Accuracy</w:t>
+            </w:r>
+          </w:p>
+        </w:tc>
+        <w:tc>
+          <w:tcPr>
+            <w:tcW w:w="0" w:type="auto"/>
+            <w:hideMark/>
+          </w:tcPr>
+          <w:p>
+            <w:pPr>
+              <w:spacing w:after="160" w:line="259" w:lineRule="auto"/>
+              <w:rPr>
+                <w:b/>
+                <w:bCs/>
+              </w:rPr>
+            </w:pPr>
+            <w:r>
+              <w:rPr>
+                <w:b/>
+                <w:bCs/>
+              </w:rPr>
+              <w:t>BA</w:t>
+            </w:r>
+          </w:p>
+        </w:tc>
+        <w:tc>
+          <w:tcPr>
+            <w:tcW w:w="0" w:type="auto"/>
+            <w:hideMark/>
+          </w:tcPr>
+          <w:p>
+            <w:pPr>
+              <w:spacing w:after="160" w:line="259" w:lineRule="auto"/>
+              <w:rPr>
+                <w:b/>
+                <w:bCs/>
+              </w:rPr>
+            </w:pPr>
+            <w:r>
+              <w:rPr>
+                <w:b/>
+                <w:bCs/>
+              </w:rPr>
+              <w:t>Macro-F1</w:t>
+            </w:r>
+          </w:p>
+        </w:tc>
+        <w:tc>
+          <w:tcPr>
+            <w:tcW w:w="0" w:type="auto"/>
+            <w:hideMark/>
+          </w:tcPr>
+          <w:p>
+            <w:pPr>
+              <w:spacing w:after="160" w:line="259" w:lineRule="auto"/>
+              <w:rPr>
+                <w:b/>
+                <w:bCs/>
+              </w:rPr>
+            </w:pPr>
+            <w:r>
+              <w:rPr>
+                <w:b/>
+                <w:bCs/>
+              </w:rPr>
+              <w:t>Low R</w:t>
+            </w:r>
+          </w:p>
+        </w:tc>
+        <w:tc>
+          <w:tcPr>
+            <w:tcW w:w="0" w:type="auto"/>
+            <w:hideMark/>
+          </w:tcPr>
+          <w:p>
+            <w:pPr>
+              <w:spacing w:after="160" w:line="259" w:lineRule="auto"/>
+              <w:rPr>
+                <w:b/>
+                <w:bCs/>
+              </w:rPr>
+            </w:pPr>
+            <w:r>
+              <w:rPr>
+                <w:b/>
+                <w:bCs/>
+              </w:rPr>
+              <w:t>Moderate R</w:t>
+            </w:r>
+          </w:p>
+        </w:tc>
+        <w:tc>
+          <w:tcPr>
+            <w:tcW w:w="0" w:type="auto"/>
+            <w:hideMark/>
+          </w:tcPr>
+          <w:p>
+            <w:pPr>
+              <w:spacing w:after="160" w:line="259" w:lineRule="auto"/>
+              <w:rPr>
+                <w:b/>
+                <w:bCs/>
+              </w:rPr>
+            </w:pPr>
+            <w:r>
+              <w:rPr>
+                <w:b/>
+                <w:bCs/>
+              </w:rPr>
+              <w:t>High R</w:t>
+            </w:r>
+          </w:p>
+        </w:tc>
+        <w:tc>
+          <w:tcPr>
+            <w:tcW w:w="0" w:type="auto"/>
+            <w:hideMark/>
+          </w:tcPr>
+          <w:p>
+            <w:pPr>
+              <w:spacing w:after="160" w:line="259" w:lineRule="auto"/>
+              <w:rPr>
+                <w:b/>
+                <w:bCs/>
+              </w:rPr>
+            </w:pPr>
+            <w:r>
+              <w:rPr>
+                <w:b/>
+                <w:bCs/>
+              </w:rPr>
+              <w:t>H→L</w:t>
+            </w:r>
+          </w:p>
+        </w:tc>
+      </w:tr>
+      <w:tr>
+        <w:tc>
+          <w:tcPr>
+            <w:tcW w:w="0" w:type="auto"/>
+            <w:hideMark/>
+          </w:tcPr>
+          <w:p>
+            <w:pPr>
+              <w:spacing w:after="160" w:line="259" w:lineRule="auto"/>
+            </w:pPr>
+            <w:r>
+              <w:rPr>
+                <w:b/>
+                <w:bCs/>
+              </w:rPr>
+              <w:t>Baseline</w:t>
+            </w:r>
+          </w:p>
+        </w:tc>
+        <w:tc>
+          <w:tcPr>
+            <w:tcW w:w="0" w:type="auto"/>
+            <w:hideMark/>
+          </w:tcPr>
+          <w:p>
+            <w:pPr>
+              <w:spacing w:after="160" w:line="259" w:lineRule="auto"/>
+            </w:pPr>
+            <w:r>
+              <w:rPr>
+                <w:b/>
+                <w:bCs/>
+              </w:rPr>
+              <w:t>0.7215</w:t>
+            </w:r>
+          </w:p>
+        </w:tc>
+        <w:tc>
+          <w:tcPr>
+            <w:tcW w:w="0" w:type="auto"/>
+            <w:hideMark/>
+          </w:tcPr>
+          <w:p>
+            <w:pPr>
+              <w:spacing w:after="160" w:line="259" w:lineRule="auto"/>
+            </w:pPr>
+            <w:r>
+              <w:t>0.6624</w:t>
+            </w:r>
+          </w:p>
+        </w:tc>
+        <w:tc>
+          <w:tcPr>
+            <w:tcW w:w="0" w:type="auto"/>
+            <w:hideMark/>
+          </w:tcPr>
+          <w:p>
+            <w:pPr>
+              <w:spacing w:after="160" w:line="259" w:lineRule="auto"/>
+            </w:pPr>
+            <w:r>
+              <w:rPr>
+                <w:b/>
+                <w:bCs/>
+              </w:rPr>
+              <w:t>0.5577</w:t>
+            </w:r>
+          </w:p>
+        </w:tc>
+        <w:tc>
+          <w:tcPr>
+            <w:tcW w:w="0" w:type="auto"/>
+            <w:hideMark/>
+          </w:tcPr>
+          <w:p>
+            <w:pPr>
+              <w:spacing w:after="160" w:line="259" w:lineRule="auto"/>
+            </w:pPr>
+            <w:r>
+              <w:t>0.7551</w:t>
+            </w:r>
+          </w:p>
+        </w:tc>
+        <w:tc>
+          <w:tcPr>
+            <w:tcW w:w="0" w:type="auto"/>
+            <w:hideMark/>
+          </w:tcPr>
+          <w:p>
+            <w:pPr>
+              <w:spacing w:after="160" w:line="259" w:lineRule="auto"/>
+            </w:pPr>
+            <w:r>
+              <w:rPr>
+                <w:b/>
+                <w:bCs/>
+              </w:rPr>
+              <w:t>0.4952</w:t>
+            </w:r>
+          </w:p>
+        </w:tc>
+        <w:tc>
+          <w:tcPr>
+            <w:tcW w:w="0" w:type="auto"/>
+            <w:hideMark/>
+          </w:tcPr>
+          <w:p>
+            <w:pPr>
+              <w:spacing w:after="160" w:line="259" w:lineRule="auto"/>
+            </w:pPr>
+            <w:r>
+              <w:t>0.7368</w:t>
+            </w:r>
+          </w:p>
+        </w:tc>
+        <w:tc>
+          <w:tcPr>
+            <w:tcW w:w="0" w:type="auto"/>
+            <w:hideMark/>
+          </w:tcPr>
+          <w:p>
+            <w:pPr>
+              <w:spacing w:after="160" w:line="259" w:lineRule="auto"/>
+            </w:pPr>
+            <w:r>
+              <w:t>2</w:t>
+            </w:r>
+          </w:p>
+        </w:tc>
+      </w:tr>
+      <w:tr>
+        <w:tc>
+          <w:tcPr>
+            <w:tcW w:w="0" w:type="auto"/>
+            <w:hideMark/>
+          </w:tcPr>
+          <w:p>
+            <w:pPr>
+              <w:spacing w:after="160" w:line="259" w:lineRule="auto"/>
+            </w:pPr>
+            <w:r>
+              <w:t>ANFIS-A</w:t>
+            </w:r>
+          </w:p>
+        </w:tc>
+        <w:tc>
+          <w:tcPr>
+            <w:tcW w:w="0" w:type="auto"/>
+            <w:hideMark/>
+          </w:tcPr>
+          <w:p>
+            <w:pPr>
+              <w:spacing w:after="160" w:line="259" w:lineRule="auto"/>
+            </w:pPr>
+            <w:r>
+              <w:t>0.7203</w:t>
+            </w:r>
+          </w:p>
+        </w:tc>
+        <w:tc>
+          <w:tcPr>
+            <w:tcW w:w="0" w:type="auto"/>
+            <w:hideMark/>
+          </w:tcPr>
+          <w:p>
+            <w:pPr>
+              <w:spacing w:after="160" w:line="259" w:lineRule="auto"/>
+            </w:pPr>
+            <w:r>
+              <w:rPr>
+                <w:b/>
+                <w:bCs/>
+              </w:rPr>
+              <w:t>0.6648</w:t>
+            </w:r>
+          </w:p>
+        </w:tc>
+        <w:tc>
+          <w:tcPr>
+            <w:tcW w:w="0" w:type="auto"/>
+            <w:hideMark/>
+          </w:tcPr>
+          <w:p>
+            <w:pPr>
+              <w:spacing w:after="160" w:line="259" w:lineRule="auto"/>
+            </w:pPr>
+            <w:r>
+              <w:t>0.5428</w:t>
+            </w:r>
+          </w:p>
+        </w:tc>
+        <w:tc>
+          <w:tcPr>
+            <w:tcW w:w="0" w:type="auto"/>
+            <w:hideMark/>
+          </w:tcPr>
+          <w:p>
+            <w:pPr>
+              <w:spacing w:after="160" w:line="259" w:lineRule="auto"/>
+            </w:pPr>
+            <w:r>
+              <w:t>0.7551</w:t>
+            </w:r>
+          </w:p>
+        </w:tc>
+        <w:tc>
+          <w:tcPr>
+            <w:tcW w:w="0" w:type="auto"/>
+            <w:hideMark/>
+          </w:tcPr>
+          <w:p>
+            <w:pPr>
+              <w:spacing w:after="160" w:line="259" w:lineRule="auto"/>
+            </w:pPr>
+            <w:r>
+              <w:t>0.4762</w:t>
+            </w:r>
+          </w:p>
+        </w:tc>
+        <w:tc>
+          <w:tcPr>
+            <w:tcW w:w="0" w:type="auto"/>
+            <w:hideMark/>
+          </w:tcPr>
+          <w:p>
+            <w:pPr>
+              <w:spacing w:after="160" w:line="259" w:lineRule="auto"/>
+            </w:pPr>
+            <w:r>
+              <w:rPr>
+                <w:b/>
+                <w:bCs/>
+              </w:rPr>
+              <w:t>0.7632</w:t>
+            </w:r>
+          </w:p>
+        </w:tc>
+        <w:tc>
+          <w:tcPr>
+            <w:tcW w:w="0" w:type="auto"/>
+            <w:hideMark/>
+          </w:tcPr>
+          <w:p>
+            <w:pPr>
+              <w:spacing w:after="160" w:line="259" w:lineRule="auto"/>
+            </w:pPr>
+            <w:r>
+              <w:t>2</w:t>
+            </w:r>
+          </w:p>
+        </w:tc>
+      </w:tr>
+      <w:tr>
+        <w:tc>
+          <w:tcPr>
+            <w:tcW w:w="0" w:type="auto"/>
+            <w:hideMark/>
+          </w:tcPr>
+          <w:p>
+            <w:pPr>
+              <w:spacing w:after="160" w:line="259" w:lineRule="auto"/>
+            </w:pPr>
+            <w:r>
+              <w:t>ANFIS-B</w:t>
+            </w:r>
+          </w:p>
+        </w:tc>
+        <w:tc>
+          <w:tcPr>
+            <w:tcW w:w="0" w:type="auto"/>
+            <w:hideMark/>
+          </w:tcPr>
+          <w:p>
+            <w:pPr>
+              <w:spacing w:after="160" w:line="259" w:lineRule="auto"/>
+            </w:pPr>
+            <w:r>
+              <w:t>0.7155</w:t>
+            </w:r>
+          </w:p>
+        </w:tc>
+        <w:tc>
+          <w:tcPr>
+            <w:tcW w:w="0" w:type="auto"/>
+            <w:hideMark/>
+          </w:tcPr>
+          <w:p>
+            <w:pPr>
+              <w:spacing w:after="160" w:line="259" w:lineRule="auto"/>
+            </w:pPr>
+            <w:r>
+              <w:t>0.6521</w:t>
+            </w:r>
+          </w:p>
+        </w:tc>
+        <w:tc>
+          <w:tcPr>
+            <w:tcW w:w="0" w:type="auto"/>
+            <w:hideMark/>
+          </w:tcPr>
+          <w:p>
+            <w:pPr>
+              <w:spacing w:after="160" w:line="259" w:lineRule="auto"/>
+            </w:pPr>
+            <w:r>
+              <w:t>0.5300</w:t>
+            </w:r>
+          </w:p>
+        </w:tc>
+        <w:tc>
+          <w:tcPr>
+            <w:tcW w:w="0" w:type="auto"/>
+            <w:hideMark/>
+          </w:tcPr>
+          <w:p>
+            <w:pPr>
+              <w:spacing w:after="160" w:line="259" w:lineRule="auto"/>
+            </w:pPr>
+            <w:r>
+              <w:t>0.7551</w:t>
+            </w:r>
+          </w:p>
+        </w:tc>
+        <w:tc>
+          <w:tcPr>
+            <w:tcW w:w="0" w:type="auto"/>
+            <w:hideMark/>
+          </w:tcPr>
+          <w:p>
+            <w:pPr>
+              <w:spacing w:after="160" w:line="259" w:lineRule="auto"/>
+            </w:pPr>
+            <w:r>
+              <w:t>0.4381</w:t>
+            </w:r>
+          </w:p>
+        </w:tc>
+        <w:tc>
+          <w:tcPr>
+            <w:tcW w:w="0" w:type="auto"/>
+            <w:hideMark/>
+          </w:tcPr>
+          <w:p>
+            <w:pPr>
+              <w:spacing w:after="160" w:line="259" w:lineRule="auto"/>
+            </w:pPr>
+            <w:r>
+              <w:t>0.7632</w:t>
+            </w:r>
+          </w:p>
+        </w:tc>
+        <w:tc>
+          <w:tcPr>
+            <w:tcW w:w="0" w:type="auto"/>
+            <w:hideMark/>
+          </w:tcPr>
+          <w:p>
+            <w:pPr>
+              <w:spacing w:after="160" w:line="259" w:lineRule="auto"/>
+            </w:pPr>
+            <w:r>
+              <w:t>2</w:t>
+            </w:r>
+          </w:p>
+        </w:tc>
+      </w:tr>
+      <w:tr>
+        <w:tc>
+          <w:tcPr>
+            <w:tcW w:w="0" w:type="auto"/>
+            <w:hideMark/>
+          </w:tcPr>
+          <w:p>
+            <w:pPr>
+              <w:spacing w:after="160" w:line="259" w:lineRule="auto"/>
+            </w:pPr>
+            <w:r>
+              <w:t>ANFIS-C</w:t>
+            </w:r>
+          </w:p>
+        </w:tc>
+        <w:tc>
+          <w:tcPr>
+            <w:tcW w:w="0" w:type="auto"/>
+            <w:hideMark/>
+          </w:tcPr>
+          <w:p>
+            <w:pPr>
+              <w:spacing w:after="160" w:line="259" w:lineRule="auto"/>
+            </w:pPr>
+            <w:r>
+              <w:t>0.6459</w:t>
+            </w:r>
+          </w:p>
+        </w:tc>
+        <w:tc>
+          <w:tcPr>
+            <w:tcW w:w="0" w:type="auto"/>
+            <w:hideMark/>
+          </w:tcPr>
+          <w:p>
+            <w:pPr>
+              <w:spacing w:after="160" w:line="259" w:lineRule="auto"/>
+            </w:pPr>
+            <w:r>
+              <w:t>0.6028</w:t>
+            </w:r>
+          </w:p>
+        </w:tc>
+        <w:tc>
+          <w:tcPr>
+            <w:tcW w:w="0" w:type="auto"/>
+            <w:hideMark/>
+          </w:tcPr>
+          <w:p>
+            <w:pPr>
+              <w:spacing w:after="160" w:line="259" w:lineRule="auto"/>
+            </w:pPr>
+            <w:r>
+              <w:t>0.4518</w:t>
+            </w:r>
+          </w:p>
+        </w:tc>
+        <w:tc>
+          <w:tcPr>
+            <w:tcW w:w="0" w:type="auto"/>
+            <w:hideMark/>
+          </w:tcPr>
+          <w:p>
+            <w:pPr>
+              <w:spacing w:after="160" w:line="259" w:lineRule="auto"/>
+            </w:pPr>
+            <w:r>
+              <w:t>0.6855</w:t>
+            </w:r>
+          </w:p>
+        </w:tc>
+        <w:tc>
+          <w:tcPr>
+            <w:tcW w:w="0" w:type="auto"/>
+            <w:hideMark/>
+          </w:tcPr>
+          <w:p>
+            <w:pPr>
+              <w:spacing w:after="160" w:line="259" w:lineRule="auto"/>
+            </w:pPr>
+            <w:r>
+              <w:t>0.3333</w:t>
+            </w:r>
+          </w:p>
+        </w:tc>
+        <w:tc>
+          <w:tcPr>
+            <w:tcW w:w="0" w:type="auto"/>
+            <w:hideMark/>
+          </w:tcPr>
+          <w:p>
+            <w:pPr>
+              <w:spacing w:after="160" w:line="259" w:lineRule="auto"/>
+            </w:pPr>
+            <w:r>
+              <w:t>0.7895</w:t>
+            </w:r>
+          </w:p>
+        </w:tc>
+        <w:tc>
+          <w:tcPr>
+            <w:tcW w:w="0" w:type="auto"/>
+            <w:hideMark/>
+          </w:tcPr>
+          <w:p>
+            <w:pPr>
+              <w:spacing w:after="160" w:line="259" w:lineRule="auto"/>
+            </w:pPr>
+            <w:r>
+              <w:t>2</w:t>
+            </w:r>
+          </w:p>
+        </w:tc>
+      </w:tr>
+      <w:tr>
+        <w:tc>
+          <w:tcPr>
+            <w:tcW w:w="0" w:type="auto"/>
+            <w:hideMark/>
+          </w:tcPr>
+          <w:p>
+            <w:pPr>
+              <w:spacing w:after="160" w:line="259" w:lineRule="auto"/>
+            </w:pPr>
+            <w:r>
+              <w:t>ANFIS-D</w:t>
+            </w:r>
+          </w:p>
+        </w:tc>
+        <w:tc>
+          <w:tcPr>
+            <w:tcW w:w="0" w:type="auto"/>
+            <w:hideMark/>
+          </w:tcPr>
+          <w:p>
+            <w:pPr>
+              <w:spacing w:after="160" w:line="259" w:lineRule="auto"/>
+            </w:pPr>
+            <w:r>
+              <w:t>0.6507</w:t>
+            </w:r>
+          </w:p>
+        </w:tc>
+        <w:tc>
+          <w:tcPr>
+            <w:tcW w:w="0" w:type="auto"/>
+            <w:hideMark/>
+          </w:tcPr>
+          <w:p>
+            <w:pPr>
+              <w:spacing w:after="160" w:line="259" w:lineRule="auto"/>
+            </w:pPr>
+            <w:r>
+              <w:t>0.5213</w:t>
+            </w:r>
+          </w:p>
+        </w:tc>
+        <w:tc>
+          <w:tcPr>
+            <w:tcW w:w="0" w:type="auto"/>
+            <w:hideMark/>
+          </w:tcPr>
+          <w:p>
+            <w:pPr>
+              <w:spacing w:after="160" w:line="259" w:lineRule="auto"/>
+            </w:pPr>
+            <w:r>
+              <w:t>0.3611</w:t>
+            </w:r>
+          </w:p>
+        </w:tc>
+        <w:tc>
+          <w:tcPr>
+            <w:tcW w:w="0" w:type="auto"/>
+            <w:hideMark/>
+          </w:tcPr>
+          <w:p>
+            <w:pPr>
+              <w:spacing w:after="160" w:line="259" w:lineRule="auto"/>
+            </w:pPr>
+            <w:r>
+              <w:t>0.7362</w:t>
+            </w:r>
+          </w:p>
+        </w:tc>
+        <w:tc>
+          <w:tcPr>
+            <w:tcW w:w="0" w:type="auto"/>
+            <w:hideMark/>
+          </w:tcPr>
+          <w:p>
+            <w:pPr>
+              <w:spacing w:after="160" w:line="259" w:lineRule="auto"/>
+            </w:pPr>
+            <w:r>
+              <w:t>0.0381</w:t>
+            </w:r>
+          </w:p>
+        </w:tc>
+        <w:tc>
+          <w:tcPr>
+            <w:tcW w:w="0" w:type="auto"/>
+            <w:hideMark/>
+          </w:tcPr>
+          <w:p>
+            <w:pPr>
+              <w:spacing w:after="160" w:line="259" w:lineRule="auto"/>
+            </w:pPr>
+            <w:r>
+              <w:t>0.7895</w:t>
+            </w:r>
+          </w:p>
+        </w:tc>
+        <w:tc>
+          <w:tcPr>
+            <w:tcW w:w="0" w:type="auto"/>
+            <w:hideMark/>
+          </w:tcPr>
+          <w:p>
+            <w:pPr>
+              <w:spacing w:after="160" w:line="259" w:lineRule="auto"/>
+            </w:pPr>
+            <w:r>
+              <w:t>4</w:t>
+            </w:r>
+          </w:p>
+        </w:tc>
+      </w:tr>
+    </w:tbl>
+    <w:p/>
+    <w:p>
+      <w:r>
+        <w:t>Five independent seeds</w:t>
+      </w:r>
+      <w:r>
+        <w:t xml:space="preserve"> </w:t>
+      </w:r>
+      <w:r>
+        <w:t>mean result</w:t>
+      </w:r>
+    </w:p>
+    <w:p>
+      <w:r>
+        <w:t>Seeds:</w:t>
+      </w:r>
+    </w:p>
+    <w:p>
+      <w:r>
+        <w:t>42, 52, 62, 72, 82</w:t>
+      </w:r>
+    </w:p>
+    <w:tbl>
+      <w:tblPr>
+        <w:tblStyle w:val="TableGrid"/>
+        <w:tblW w:w="0" w:type="auto"/>
+        <w:tblLook w:val="04A0" w:firstRow="1" w:lastRow="0" w:firstColumn="1" w:lastColumn="0" w:noHBand="0" w:noVBand="1"/>
+      </w:tblPr>
+      <w:tblGrid>
+        <w:gridCol w:w="1081"/>
+        <w:gridCol w:w="1145"/>
+        <w:gridCol w:w="870"/>
+        <w:gridCol w:w="1159"/>
+        <w:gridCol w:w="867"/>
+        <w:gridCol w:w="1353"/>
+        <w:gridCol w:w="867"/>
+        <w:gridCol w:w="621"/>
+      </w:tblGrid>
+      <w:tr>
+        <w:tc>
+          <w:tcPr>
+            <w:tcW w:w="0" w:type="auto"/>
+            <w:hideMark/>
+          </w:tcPr>
+          <w:p>
+            <w:pPr>
+              <w:spacing w:after="160" w:line="259" w:lineRule="auto"/>
+              <w:rPr>
+                <w:b/>
+                <w:bCs/>
+              </w:rPr>
+            </w:pPr>
+            <w:r>
+              <w:rPr>
+                <w:b/>
+                <w:bCs/>
+              </w:rPr>
+              <w:t>Model</w:t>
+            </w:r>
+          </w:p>
+        </w:tc>
+        <w:tc>
+          <w:tcPr>
+            <w:tcW w:w="0" w:type="auto"/>
+            <w:hideMark/>
+          </w:tcPr>
+          <w:p>
+            <w:pPr>
+              <w:spacing w:after="160" w:line="259" w:lineRule="auto"/>
+              <w:rPr>
+                <w:b/>
+                <w:bCs/>
+              </w:rPr>
+            </w:pPr>
+            <w:r>
+              <w:rPr>
+                <w:b/>
+                <w:bCs/>
+              </w:rPr>
+              <w:t>Accuracy</w:t>
+            </w:r>
+          </w:p>
+        </w:tc>
+        <w:tc>
+          <w:tcPr>
+            <w:tcW w:w="0" w:type="auto"/>
+            <w:hideMark/>
+          </w:tcPr>
+          <w:p>
+            <w:pPr>
+              <w:spacing w:after="160" w:line="259" w:lineRule="auto"/>
+              <w:rPr>
+                <w:b/>
+                <w:bCs/>
+              </w:rPr>
+            </w:pPr>
+            <w:r>
+              <w:rPr>
+                <w:b/>
+                <w:bCs/>
+              </w:rPr>
+              <w:t>BA</w:t>
+            </w:r>
+          </w:p>
+        </w:tc>
+        <w:tc>
+          <w:tcPr>
+            <w:tcW w:w="0" w:type="auto"/>
+            <w:hideMark/>
+          </w:tcPr>
+          <w:p>
+            <w:pPr>
+              <w:spacing w:after="160" w:line="259" w:lineRule="auto"/>
+              <w:rPr>
+                <w:b/>
+                <w:bCs/>
+              </w:rPr>
+            </w:pPr>
+            <w:r>
+              <w:rPr>
+                <w:b/>
+                <w:bCs/>
+              </w:rPr>
+              <w:t>Macro-F1</w:t>
+            </w:r>
+          </w:p>
+        </w:tc>
+        <w:tc>
+          <w:tcPr>
+            <w:tcW w:w="0" w:type="auto"/>
+            <w:hideMark/>
+          </w:tcPr>
+          <w:p>
+            <w:pPr>
+              <w:spacing w:after="160" w:line="259" w:lineRule="auto"/>
+              <w:rPr>
+                <w:b/>
+                <w:bCs/>
+              </w:rPr>
+            </w:pPr>
+            <w:r>
+              <w:rPr>
+                <w:b/>
+                <w:bCs/>
+              </w:rPr>
+              <w:t>Low R</w:t>
+            </w:r>
+          </w:p>
+        </w:tc>
+        <w:tc>
+          <w:tcPr>
+            <w:tcW w:w="0" w:type="auto"/>
+            <w:hideMark/>
+          </w:tcPr>
+          <w:p>
+            <w:pPr>
+              <w:spacing w:after="160" w:line="259" w:lineRule="auto"/>
+              <w:rPr>
+                <w:b/>
+                <w:bCs/>
+              </w:rPr>
+            </w:pPr>
+            <w:r>
+              <w:rPr>
+                <w:b/>
+                <w:bCs/>
+              </w:rPr>
+              <w:t>Moderate R</w:t>
+            </w:r>
+          </w:p>
+        </w:tc>
+        <w:tc>
+          <w:tcPr>
+            <w:tcW w:w="0" w:type="auto"/>
+            <w:hideMark/>
+          </w:tcPr>
+          <w:p>
+            <w:pPr>
+              <w:spacing w:after="160" w:line="259" w:lineRule="auto"/>
+              <w:rPr>
+                <w:b/>
+                <w:bCs/>
+              </w:rPr>
+            </w:pPr>
+            <w:r>
+              <w:rPr>
+                <w:b/>
+                <w:bCs/>
+              </w:rPr>
+              <w:t>High R</w:t>
+            </w:r>
+          </w:p>
+        </w:tc>
+        <w:tc>
+          <w:tcPr>
+            <w:tcW w:w="0" w:type="auto"/>
+            <w:hideMark/>
+          </w:tcPr>
+          <w:p>
+            <w:pPr>
+              <w:spacing w:after="160" w:line="259" w:lineRule="auto"/>
+              <w:rPr>
+                <w:b/>
+                <w:bCs/>
+              </w:rPr>
+            </w:pPr>
+            <w:r>
+              <w:rPr>
+                <w:b/>
+                <w:bCs/>
+              </w:rPr>
+              <w:t>H→L</w:t>
+            </w:r>
+          </w:p>
+        </w:tc>
+      </w:tr>
+      <w:tr>
+        <w:tc>
+          <w:tcPr>
+            <w:tcW w:w="0" w:type="auto"/>
+            <w:hideMark/>
+          </w:tcPr>
+          <w:p>
+            <w:pPr>
+              <w:spacing w:after="160" w:line="259" w:lineRule="auto"/>
+            </w:pPr>
+            <w:r>
+              <w:rPr>
+                <w:b/>
+                <w:bCs/>
+              </w:rPr>
+              <w:t>Baseline</w:t>
+            </w:r>
+          </w:p>
+        </w:tc>
+        <w:tc>
+          <w:tcPr>
+            <w:tcW w:w="0" w:type="auto"/>
+            <w:hideMark/>
+          </w:tcPr>
+          <w:p>
+            <w:pPr>
+              <w:spacing w:after="160" w:line="259" w:lineRule="auto"/>
+            </w:pPr>
+            <w:r>
+              <w:rPr>
+                <w:b/>
+                <w:bCs/>
+              </w:rPr>
+              <w:t>0.7054</w:t>
+            </w:r>
+          </w:p>
+        </w:tc>
+        <w:tc>
+          <w:tcPr>
+            <w:tcW w:w="0" w:type="auto"/>
+            <w:hideMark/>
+          </w:tcPr>
+          <w:p>
+            <w:pPr>
+              <w:spacing w:after="160" w:line="259" w:lineRule="auto"/>
+            </w:pPr>
+            <w:r>
+              <w:rPr>
+                <w:b/>
+                <w:bCs/>
+              </w:rPr>
+              <w:t>0.6477</w:t>
+            </w:r>
+          </w:p>
+        </w:tc>
+        <w:tc>
+          <w:tcPr>
+            <w:tcW w:w="0" w:type="auto"/>
+            <w:hideMark/>
+          </w:tcPr>
+          <w:p>
+            <w:pPr>
+              <w:spacing w:after="160" w:line="259" w:lineRule="auto"/>
+            </w:pPr>
+            <w:r>
+              <w:rPr>
+                <w:b/>
+                <w:bCs/>
+              </w:rPr>
+              <w:t>0.5433</w:t>
+            </w:r>
+          </w:p>
+        </w:tc>
+        <w:tc>
+          <w:tcPr>
+            <w:tcW w:w="0" w:type="auto"/>
+            <w:hideMark/>
+          </w:tcPr>
+          <w:p>
+            <w:pPr>
+              <w:spacing w:after="160" w:line="259" w:lineRule="auto"/>
+            </w:pPr>
+            <w:r>
+              <w:t>0.7377</w:t>
+            </w:r>
+          </w:p>
+        </w:tc>
+        <w:tc>
+          <w:tcPr>
+            <w:tcW w:w="0" w:type="auto"/>
+            <w:hideMark/>
+          </w:tcPr>
+          <w:p>
+            <w:pPr>
+              <w:spacing w:after="160" w:line="259" w:lineRule="auto"/>
+            </w:pPr>
+            <w:r>
+              <w:rPr>
+                <w:b/>
+                <w:bCs/>
+              </w:rPr>
+              <w:t>0.4895</w:t>
+            </w:r>
+          </w:p>
+        </w:tc>
+        <w:tc>
+          <w:tcPr>
+            <w:tcW w:w="0" w:type="auto"/>
+            <w:hideMark/>
+          </w:tcPr>
+          <w:p>
+            <w:pPr>
+              <w:spacing w:after="160" w:line="259" w:lineRule="auto"/>
+            </w:pPr>
+            <w:r>
+              <w:t>0.7158</w:t>
+            </w:r>
+          </w:p>
+        </w:tc>
+        <w:tc>
+          <w:tcPr>
+            <w:tcW w:w="0" w:type="auto"/>
+            <w:hideMark/>
+          </w:tcPr>
+          <w:p>
+            <w:pPr>
+              <w:spacing w:after="160" w:line="259" w:lineRule="auto"/>
+            </w:pPr>
+            <w:r>
+              <w:t>2.2</w:t>
+            </w:r>
+          </w:p>
+        </w:tc>
+      </w:tr>
+      <w:tr>
+        <w:tc>
+          <w:tcPr>
+            <w:tcW w:w="0" w:type="auto"/>
+            <w:hideMark/>
+          </w:tcPr>
+          <w:p>
+            <w:pPr>
+              <w:spacing w:after="160" w:line="259" w:lineRule="auto"/>
+            </w:pPr>
+            <w:r>
+              <w:t>ANFIS-A</w:t>
+            </w:r>
+          </w:p>
+        </w:tc>
+        <w:tc>
+          <w:tcPr>
+            <w:tcW w:w="0" w:type="auto"/>
+            <w:hideMark/>
+          </w:tcPr>
+          <w:p>
+            <w:pPr>
+              <w:spacing w:after="160" w:line="259" w:lineRule="auto"/>
+            </w:pPr>
+            <w:r>
+              <w:t>0.7037</w:t>
+            </w:r>
+          </w:p>
+        </w:tc>
+        <w:tc>
+          <w:tcPr>
+            <w:tcW w:w="0" w:type="auto"/>
+            <w:hideMark/>
+          </w:tcPr>
+          <w:p>
+            <w:pPr>
+              <w:spacing w:after="160" w:line="259" w:lineRule="auto"/>
+            </w:pPr>
+            <w:r>
+              <w:t>0.6365</w:t>
+            </w:r>
+          </w:p>
+        </w:tc>
+        <w:tc>
+          <w:tcPr>
+            <w:tcW w:w="0" w:type="auto"/>
+            <w:hideMark/>
+          </w:tcPr>
+          <w:p>
+            <w:pPr>
+              <w:spacing w:after="160" w:line="259" w:lineRule="auto"/>
+            </w:pPr>
+            <w:r>
+              <w:t>0.5272</w:t>
+            </w:r>
+          </w:p>
+        </w:tc>
+        <w:tc>
+          <w:tcPr>
+            <w:tcW w:w="0" w:type="auto"/>
+            <w:hideMark/>
+          </w:tcPr>
+          <w:p>
+            <w:pPr>
+              <w:spacing w:after="160" w:line="259" w:lineRule="auto"/>
+            </w:pPr>
+            <w:r>
+              <w:t>0.7377</w:t>
+            </w:r>
+          </w:p>
+        </w:tc>
+        <w:tc>
+          <w:tcPr>
+            <w:tcW w:w="0" w:type="auto"/>
+            <w:hideMark/>
+          </w:tcPr>
+          <w:p>
+            <w:pPr>
+              <w:spacing w:after="160" w:line="259" w:lineRule="auto"/>
+            </w:pPr>
+            <w:r>
+              <w:t>0.4876</w:t>
+            </w:r>
+          </w:p>
+        </w:tc>
+        <w:tc>
+          <w:tcPr>
+            <w:tcW w:w="0" w:type="auto"/>
+            <w:hideMark/>
+          </w:tcPr>
+          <w:p>
+            <w:pPr>
+              <w:spacing w:after="160" w:line="259" w:lineRule="auto"/>
+            </w:pPr>
+            <w:r>
+              <w:t>0.6842</w:t>
+            </w:r>
+          </w:p>
+        </w:tc>
+        <w:tc>
+          <w:tcPr>
+            <w:tcW w:w="0" w:type="auto"/>
+            <w:hideMark/>
+          </w:tcPr>
+          <w:p>
+            <w:pPr>
+              <w:spacing w:after="160" w:line="259" w:lineRule="auto"/>
+            </w:pPr>
+            <w:r>
+              <w:t>2.2</w:t>
+            </w:r>
+          </w:p>
+        </w:tc>
+      </w:tr>
+      <w:tr>
+        <w:tc>
+          <w:tcPr>
+            <w:tcW w:w="0" w:type="auto"/>
+            <w:hideMark/>
+          </w:tcPr>
+          <w:p>
+            <w:pPr>
+              <w:spacing w:after="160" w:line="259" w:lineRule="auto"/>
+            </w:pPr>
+            <w:r>
+              <w:t>ANFIS-B</w:t>
+            </w:r>
+          </w:p>
+        </w:tc>
+        <w:tc>
+          <w:tcPr>
+            <w:tcW w:w="0" w:type="auto"/>
+            <w:hideMark/>
+          </w:tcPr>
+          <w:p>
+            <w:pPr>
+              <w:spacing w:after="160" w:line="259" w:lineRule="auto"/>
+            </w:pPr>
+            <w:r>
+              <w:t>0.6912</w:t>
+            </w:r>
+          </w:p>
+        </w:tc>
+        <w:tc>
+          <w:tcPr>
+            <w:tcW w:w="0" w:type="auto"/>
+            <w:hideMark/>
+          </w:tcPr>
+          <w:p>
+            <w:pPr>
+              <w:spacing w:after="160" w:line="259" w:lineRule="auto"/>
+            </w:pPr>
+            <w:r>
+              <w:t>0.6281</w:t>
+            </w:r>
+          </w:p>
+        </w:tc>
+        <w:tc>
+          <w:tcPr>
+            <w:tcW w:w="0" w:type="auto"/>
+            <w:hideMark/>
+          </w:tcPr>
+          <w:p>
+            <w:pPr>
+              <w:spacing w:after="160" w:line="259" w:lineRule="auto"/>
+            </w:pPr>
+            <w:r>
+              <w:t>0.4871</w:t>
+            </w:r>
+          </w:p>
+        </w:tc>
+        <w:tc>
+          <w:tcPr>
+            <w:tcW w:w="0" w:type="auto"/>
+            <w:hideMark/>
+          </w:tcPr>
+          <w:p>
+            <w:pPr>
+              <w:spacing w:after="160" w:line="259" w:lineRule="auto"/>
+            </w:pPr>
+            <w:r>
+              <w:t>0.7377</w:t>
+            </w:r>
+          </w:p>
+        </w:tc>
+        <w:tc>
+          <w:tcPr>
+            <w:tcW w:w="0" w:type="auto"/>
+            <w:hideMark/>
+          </w:tcPr>
+          <w:p>
+            <w:pPr>
+              <w:spacing w:after="160" w:line="259" w:lineRule="auto"/>
+            </w:pPr>
+            <w:r>
+              <w:t>0.3467</w:t>
+            </w:r>
+          </w:p>
+        </w:tc>
+        <w:tc>
+          <w:tcPr>
+            <w:tcW w:w="0" w:type="auto"/>
+            <w:hideMark/>
+          </w:tcPr>
+          <w:p>
+            <w:pPr>
+              <w:spacing w:after="160" w:line="259" w:lineRule="auto"/>
+            </w:pPr>
+            <w:r>
+              <w:t>0.8000</w:t>
+            </w:r>
+          </w:p>
+        </w:tc>
+        <w:tc>
+          <w:tcPr>
+            <w:tcW w:w="0" w:type="auto"/>
+            <w:hideMark/>
+          </w:tcPr>
+          <w:p>
+            <w:pPr>
+              <w:spacing w:after="160" w:line="259" w:lineRule="auto"/>
+            </w:pPr>
+            <w:r>
+              <w:t>2.2</w:t>
+            </w:r>
+          </w:p>
+        </w:tc>
+      </w:tr>
+      <w:tr>
+        <w:tc>
+          <w:tcPr>
+            <w:tcW w:w="0" w:type="auto"/>
+            <w:hideMark/>
+          </w:tcPr>
+          <w:p>
+            <w:pPr>
+              <w:spacing w:after="160" w:line="259" w:lineRule="auto"/>
+            </w:pPr>
+            <w:r>
+              <w:t>ANFIS-C</w:t>
+            </w:r>
+          </w:p>
+        </w:tc>
+        <w:tc>
+          <w:tcPr>
+            <w:tcW w:w="0" w:type="auto"/>
+            <w:hideMark/>
+          </w:tcPr>
+          <w:p>
+            <w:pPr>
+              <w:spacing w:after="160" w:line="259" w:lineRule="auto"/>
+            </w:pPr>
+            <w:r>
+              <w:t>0.6459</w:t>
+            </w:r>
+          </w:p>
+        </w:tc>
+        <w:tc>
+          <w:tcPr>
+            <w:tcW w:w="0" w:type="auto"/>
+            <w:hideMark/>
+          </w:tcPr>
+          <w:p>
+            <w:pPr>
+              <w:spacing w:after="160" w:line="259" w:lineRule="auto"/>
+            </w:pPr>
+            <w:r>
+              <w:t>0.5928</w:t>
+            </w:r>
+          </w:p>
+        </w:tc>
+        <w:tc>
+          <w:tcPr>
+            <w:tcW w:w="0" w:type="auto"/>
+            <w:hideMark/>
+          </w:tcPr>
+          <w:p>
+            <w:pPr>
+              <w:spacing w:after="160" w:line="259" w:lineRule="auto"/>
+            </w:pPr>
+            <w:r>
+              <w:t>0.4328</w:t>
+            </w:r>
+          </w:p>
+        </w:tc>
+        <w:tc>
+          <w:tcPr>
+            <w:tcW w:w="0" w:type="auto"/>
+            <w:hideMark/>
+          </w:tcPr>
+          <w:p>
+            <w:pPr>
+              <w:spacing w:after="160" w:line="259" w:lineRule="auto"/>
+            </w:pPr>
+            <w:r>
+              <w:t>0.6951</w:t>
+            </w:r>
+          </w:p>
+        </w:tc>
+        <w:tc>
+          <w:tcPr>
+            <w:tcW w:w="0" w:type="auto"/>
+            <w:hideMark/>
+          </w:tcPr>
+          <w:p>
+            <w:pPr>
+              <w:spacing w:after="160" w:line="259" w:lineRule="auto"/>
+            </w:pPr>
+            <w:r>
+              <w:t>0.2571</w:t>
+            </w:r>
+          </w:p>
+        </w:tc>
+        <w:tc>
+          <w:tcPr>
+            <w:tcW w:w="0" w:type="auto"/>
+            <w:hideMark/>
+          </w:tcPr>
+          <w:p>
+            <w:pPr>
+              <w:spacing w:after="160" w:line="259" w:lineRule="auto"/>
+            </w:pPr>
+            <w:r>
+              <w:t>0.8263</w:t>
+            </w:r>
+          </w:p>
+        </w:tc>
+        <w:tc>
+          <w:tcPr>
+            <w:tcW w:w="0" w:type="auto"/>
+            <w:hideMark/>
+          </w:tcPr>
+          <w:p>
+            <w:pPr>
+              <w:spacing w:after="160" w:line="259" w:lineRule="auto"/>
+            </w:pPr>
+            <w:r>
+              <w:t>2.4</w:t>
+            </w:r>
+          </w:p>
+        </w:tc>
+      </w:tr>
+      <w:tr>
+        <w:tc>
+          <w:tcPr>
+            <w:tcW w:w="0" w:type="auto"/>
+            <w:hideMark/>
+          </w:tcPr>
+          <w:p>
+            <w:pPr>
+              <w:spacing w:after="160" w:line="259" w:lineRule="auto"/>
+            </w:pPr>
+            <w:r>
+              <w:t>ANFIS-D</w:t>
+            </w:r>
+          </w:p>
+        </w:tc>
+        <w:tc>
+          <w:tcPr>
+            <w:tcW w:w="0" w:type="auto"/>
+            <w:hideMark/>
+          </w:tcPr>
+          <w:p>
+            <w:pPr>
+              <w:spacing w:after="160" w:line="259" w:lineRule="auto"/>
+            </w:pPr>
+            <w:r>
+              <w:t>0.6355</w:t>
+            </w:r>
+          </w:p>
+        </w:tc>
+        <w:tc>
+          <w:tcPr>
+            <w:tcW w:w="0" w:type="auto"/>
+            <w:hideMark/>
+          </w:tcPr>
+          <w:p>
+            <w:pPr>
+              <w:spacing w:after="160" w:line="259" w:lineRule="auto"/>
+            </w:pPr>
+            <w:r>
+              <w:t>0.5184</w:t>
+            </w:r>
+          </w:p>
+        </w:tc>
+        <w:tc>
+          <w:tcPr>
+            <w:tcW w:w="0" w:type="auto"/>
+            <w:hideMark/>
+          </w:tcPr>
+          <w:p>
+            <w:pPr>
+              <w:spacing w:after="160" w:line="259" w:lineRule="auto"/>
+            </w:pPr>
+            <w:r>
+              <w:t>0.3575</w:t>
+            </w:r>
+          </w:p>
+        </w:tc>
+        <w:tc>
+          <w:tcPr>
+            <w:tcW w:w="0" w:type="auto"/>
+            <w:hideMark/>
+          </w:tcPr>
+          <w:p>
+            <w:pPr>
+              <w:spacing w:after="160" w:line="259" w:lineRule="auto"/>
+            </w:pPr>
+            <w:r>
+              <w:t>0.7162</w:t>
+            </w:r>
+          </w:p>
+        </w:tc>
+        <w:tc>
+          <w:tcPr>
+            <w:tcW w:w="0" w:type="auto"/>
+            <w:hideMark/>
+          </w:tcPr>
+          <w:p>
+            <w:pPr>
+              <w:spacing w:after="160" w:line="259" w:lineRule="auto"/>
+            </w:pPr>
+            <w:r>
+              <w:t>0.0495</w:t>
+            </w:r>
+          </w:p>
+        </w:tc>
+        <w:tc>
+          <w:tcPr>
+            <w:tcW w:w="0" w:type="auto"/>
+            <w:hideMark/>
+          </w:tcPr>
+          <w:p>
+            <w:pPr>
+              <w:spacing w:after="160" w:line="259" w:lineRule="auto"/>
+            </w:pPr>
+            <w:r>
+              <w:t>0.7895</w:t>
+            </w:r>
+          </w:p>
+        </w:tc>
+        <w:tc>
+          <w:tcPr>
+            <w:tcW w:w="0" w:type="auto"/>
+            <w:hideMark/>
+          </w:tcPr>
+          <w:p>
+            <w:pPr>
+              <w:spacing w:after="160" w:line="259" w:lineRule="auto"/>
+            </w:pPr>
+            <w:r>
+              <w:t>4.6</w:t>
+            </w:r>
+          </w:p>
+        </w:tc>
+      </w:tr>
+    </w:tbl>
+    <w:p/>
+    <w:p/>
     <w:sectPr>
       <w:pgSz w:w="12240" w:h="15840"/>
       <w:pgMar w:top="1440" w:right="1440" w:bottom="1440" w:left="1440" w:header="720" w:footer="720" w:gutter="0"/>
@@ -15595,7 +17988,6 @@
   <w:style w:type="character" w:default="1" w:styleId="DefaultParagraphFont">
     <w:name w:val="Default Paragraph Font"/>
     <w:uiPriority w:val="1"/>
-    <w:semiHidden/>
     <w:unhideWhenUsed/>
   </w:style>
   <w:style w:type="table" w:default="1" w:styleId="TableNormal">
@@ -16302,4 +18694,16 @@
     </a:ext>
   </a:extLst>
 </a:theme>
+</file>
+
+<file path=customXml/item1.xml><?xml version="1.0" encoding="utf-8"?>
+<b:Sources xmlns:b="http://schemas.openxmlformats.org/officeDocument/2006/bibliography" xmlns="http://schemas.openxmlformats.org/officeDocument/2006/bibliography" SelectedStyle="\APASixthEditionOfficeOnline.xsl" StyleName="APA" Version="6"/>
+</file>
+
+<file path=customXml/itemProps1.xml><?xml version="1.0" encoding="utf-8"?>
+<ds:datastoreItem xmlns:ds="http://schemas.openxmlformats.org/officeDocument/2006/customXml" ds:itemID="{08959250-D7FE-4F64-B63B-57F336A88B4F}">
+  <ds:schemaRefs>
+    <ds:schemaRef ds:uri="http://schemas.openxmlformats.org/officeDocument/2006/bibliography"/>
+  </ds:schemaRefs>
+</ds:datastoreItem>
 </file>
</xml_diff>